<commit_message>
Quelques corrections globales avant la première MEP
</commit_message>
<xml_diff>
--- a/ExsaApi/FieldOps_RapportIntervention_Template.docx
+++ b/ExsaApi/FieldOps_RapportIntervention_Template.docx
@@ -14,7 +14,7 @@
           <w:color w:val="1A1A18"/>
           <w:b/>
         </w:rPr>
-        <w:t xml:space="preserve">INT-NDOK-1005 - Remplacement Transformateur Ndokoti</w:t>
+        <w:t xml:space="preserve">INT-2026-1505-NDF - Ajout poste de commande Ndogbassi</w:t>
       </w:r>
     </w:p>
     <w:p>
@@ -35,7 +35,7 @@
           <w:sz w:val="17"/>
           <w:color w:val="6B6B66"/>
         </w:rPr>
-        <w:t xml:space="preserve">25/05/2026</w:t>
+        <w:t xml:space="preserve">13/06/2026</w:t>
       </w:r>
       <w:r>
         <w:rPr>
@@ -172,7 +172,7 @@
                 <w:color w:val="185FA5"/>
                 <w:b/>
               </w:rPr>
-              <w:t xml:space="preserve">URGENCE</w:t>
+              <w:t xml:space="preserve">PREVENTIF</w:t>
             </w:r>
           </w:p>
         </w:tc>
@@ -221,7 +221,7 @@
                 <w:color w:val="185FA5"/>
                 <w:b/>
               </w:rPr>
-              <w:t xml:space="preserve">Ndokoti</w:t>
+              <w:t xml:space="preserve">Avenue de la grasse Douala</w:t>
             </w:r>
           </w:p>
         </w:tc>
@@ -317,7 +317,7 @@
                 <w:color w:val="185FA5"/>
                 <w:b/>
               </w:rPr>
-              <w:t xml:space="preserve">13/05/2026</w:t>
+              <w:t xml:space="preserve">29/06/2026</w:t>
             </w:r>
           </w:p>
         </w:tc>
@@ -364,7 +364,7 @@
                 <w:color w:val="185FA5"/>
                 <w:b/>
               </w:rPr>
-              <w:t xml:space="preserve">02/05/2026</w:t>
+              <w:t xml:space="preserve">31/05/2026</w:t>
             </w:r>
           </w:p>
         </w:tc>
@@ -413,7 +413,7 @@
                 <w:color w:val="185FA5"/>
                 <w:b/>
               </w:rPr>
-              <w:t xml:space="preserve">22/05/2026</w:t>
+              <w:t xml:space="preserve">23/06/2026</w:t>
             </w:r>
           </w:p>
         </w:tc>
@@ -460,7 +460,7 @@
                 <w:color w:val="185FA5"/>
                 <w:b/>
               </w:rPr>
-              <w:t xml:space="preserve">20 Jours</w:t>
+              <w:t xml:space="preserve">23 Jours</w:t>
             </w:r>
           </w:p>
         </w:tc>
@@ -627,786 +627,6 @@
                 <w:b/>
               </w:rPr>
               <w:t xml:space="preserve">N° Employé</w:t>
-            </w:r>
-          </w:p>
-        </w:tc>
-      </w:tr>
-      <w:tr>
-        <w:tc>
-          <w:tcPr>
-            <w:tblW w:w="3500" w:type="dxa"/>
-            <w:tcBorders>
-              <w:top w:val="single" w:color="D8D6CF" w:sz="4"/>
-              <w:left w:val="single" w:color="D8D6CF" w:sz="4"/>
-              <w:bottom w:val="single" w:color="D8D6CF" w:sz="4"/>
-              <w:right w:val="single" w:color="D8D6CF" w:sz="4"/>
-            </w:tcBorders>
-            <w:tcMar>
-              <w:top w:w="80" w:type="dxa"/>
-              <w:bottom w:w="80" w:type="dxa"/>
-              <w:left w:w="120" w:type="dxa"/>
-              <w:right w:w="120" w:type="dxa"/>
-            </w:tcMar>
-          </w:tcPr>
-          <w:p>
-            <w:pPr>
-              <w:spacing w:before="0" w:after="0"/>
-              <w:jc w:val="left"/>
-            </w:pPr>
-            <w:r>
-              <w:rPr>
-                <w:rFonts w:ascii="Arial" w:hAnsi="Arial" w:eastAsia="Arial" w:cs="Arial"/>
-                <w:sz w:val="18"/>
-                <w:color w:val="185FA5"/>
-                <w:b/>
-              </w:rPr>
-              <w:t xml:space="preserve">magali perlin</w:t>
-            </w:r>
-          </w:p>
-        </w:tc>
-        <w:tc>
-          <w:tcPr>
-            <w:tblW w:w="3060" w:type="dxa"/>
-            <w:tcBorders>
-              <w:top w:val="single" w:color="D8D6CF" w:sz="4"/>
-              <w:left w:val="single" w:color="D8D6CF" w:sz="4"/>
-              <w:bottom w:val="single" w:color="D8D6CF" w:sz="4"/>
-              <w:right w:val="single" w:color="D8D6CF" w:sz="4"/>
-            </w:tcBorders>
-            <w:tcMar>
-              <w:top w:w="80" w:type="dxa"/>
-              <w:bottom w:w="80" w:type="dxa"/>
-              <w:left w:w="120" w:type="dxa"/>
-              <w:right w:w="120" w:type="dxa"/>
-            </w:tcMar>
-          </w:tcPr>
-          <w:p>
-            <w:pPr>
-              <w:spacing w:before="0" w:after="0"/>
-              <w:jc w:val="left"/>
-            </w:pPr>
-            <w:r>
-              <w:rPr>
-                <w:rFonts w:ascii="Arial" w:hAnsi="Arial" w:eastAsia="Arial" w:cs="Arial"/>
-                <w:sz w:val="18"/>
-                <w:color w:val="185FA5"/>
-                <w:b/>
-              </w:rPr>
-              <w:t xml:space="preserve">SUPERVISEUR</w:t>
-            </w:r>
-          </w:p>
-        </w:tc>
-        <w:tc>
-          <w:tcPr>
-            <w:tblW w:w="1500" w:type="dxa"/>
-            <w:tcBorders>
-              <w:top w:val="single" w:color="D8D6CF" w:sz="4"/>
-              <w:left w:val="single" w:color="D8D6CF" w:sz="4"/>
-              <w:bottom w:val="single" w:color="D8D6CF" w:sz="4"/>
-              <w:right w:val="single" w:color="D8D6CF" w:sz="4"/>
-            </w:tcBorders>
-            <w:tcMar>
-              <w:top w:w="80" w:type="dxa"/>
-              <w:bottom w:w="80" w:type="dxa"/>
-              <w:left w:w="120" w:type="dxa"/>
-              <w:right w:w="120" w:type="dxa"/>
-            </w:tcMar>
-          </w:tcPr>
-          <w:p>
-            <w:pPr>
-              <w:spacing w:before="0" w:after="0"/>
-              <w:jc w:val="left"/>
-            </w:pPr>
-            <w:r>
-              <w:rPr>
-                <w:rFonts w:ascii="Arial" w:hAnsi="Arial" w:eastAsia="Arial" w:cs="Arial"/>
-                <w:sz w:val="18"/>
-                <w:color w:val="185FA5"/>
-                <w:b/>
-              </w:rPr>
-              <w:t xml:space="preserve"/>
-            </w:r>
-          </w:p>
-        </w:tc>
-        <w:tc>
-          <w:tcPr>
-            <w:tblW w:w="1000" w:type="dxa"/>
-            <w:tcBorders>
-              <w:top w:val="single" w:color="D8D6CF" w:sz="4"/>
-              <w:left w:val="single" w:color="D8D6CF" w:sz="4"/>
-              <w:bottom w:val="single" w:color="D8D6CF" w:sz="4"/>
-              <w:right w:val="single" w:color="D8D6CF" w:sz="4"/>
-            </w:tcBorders>
-            <w:tcMar>
-              <w:top w:w="80" w:type="dxa"/>
-              <w:bottom w:w="80" w:type="dxa"/>
-              <w:left w:w="120" w:type="dxa"/>
-              <w:right w:w="120" w:type="dxa"/>
-            </w:tcMar>
-          </w:tcPr>
-          <w:p>
-            <w:pPr>
-              <w:spacing w:before="0" w:after="0"/>
-              <w:jc w:val="left"/>
-            </w:pPr>
-            <w:r>
-              <w:rPr>
-                <w:rFonts w:ascii="Arial" w:hAnsi="Arial" w:eastAsia="Arial" w:cs="Arial"/>
-                <w:sz w:val="18"/>
-                <w:color w:val="185FA5"/>
-                <w:b/>
-              </w:rPr>
-              <w:t xml:space="preserve">678798889</w:t>
-            </w:r>
-          </w:p>
-        </w:tc>
-      </w:tr>
-      <w:tr>
-        <w:tc>
-          <w:tcPr>
-            <w:tblW w:w="3500" w:type="dxa"/>
-            <w:tcBorders>
-              <w:top w:val="single" w:color="D8D6CF" w:sz="4"/>
-              <w:left w:val="single" w:color="D8D6CF" w:sz="4"/>
-              <w:bottom w:val="single" w:color="D8D6CF" w:sz="4"/>
-              <w:right w:val="single" w:color="D8D6CF" w:sz="4"/>
-            </w:tcBorders>
-            <w:tcMar>
-              <w:top w:w="80" w:type="dxa"/>
-              <w:bottom w:w="80" w:type="dxa"/>
-              <w:left w:w="120" w:type="dxa"/>
-              <w:right w:w="120" w:type="dxa"/>
-            </w:tcMar>
-          </w:tcPr>
-          <w:p>
-            <w:pPr>
-              <w:spacing w:before="0" w:after="0"/>
-              <w:jc w:val="left"/>
-            </w:pPr>
-            <w:r>
-              <w:rPr>
-                <w:rFonts w:ascii="Arial" w:hAnsi="Arial" w:eastAsia="Arial" w:cs="Arial"/>
-                <w:sz w:val="18"/>
-                <w:color w:val="185FA5"/>
-                <w:b/>
-              </w:rPr>
-              <w:t xml:space="preserve">Jhon doe</w:t>
-            </w:r>
-          </w:p>
-        </w:tc>
-        <w:tc>
-          <w:tcPr>
-            <w:tblW w:w="3060" w:type="dxa"/>
-            <w:tcBorders>
-              <w:top w:val="single" w:color="D8D6CF" w:sz="4"/>
-              <w:left w:val="single" w:color="D8D6CF" w:sz="4"/>
-              <w:bottom w:val="single" w:color="D8D6CF" w:sz="4"/>
-              <w:right w:val="single" w:color="D8D6CF" w:sz="4"/>
-            </w:tcBorders>
-            <w:tcMar>
-              <w:top w:w="80" w:type="dxa"/>
-              <w:bottom w:w="80" w:type="dxa"/>
-              <w:left w:w="120" w:type="dxa"/>
-              <w:right w:w="120" w:type="dxa"/>
-            </w:tcMar>
-          </w:tcPr>
-          <w:p>
-            <w:pPr>
-              <w:spacing w:before="0" w:after="0"/>
-              <w:jc w:val="left"/>
-            </w:pPr>
-            <w:r>
-              <w:rPr>
-                <w:rFonts w:ascii="Arial" w:hAnsi="Arial" w:eastAsia="Arial" w:cs="Arial"/>
-                <w:sz w:val="18"/>
-                <w:color w:val="185FA5"/>
-                <w:b/>
-              </w:rPr>
-              <w:t xml:space="preserve">TECHNICIEN</w:t>
-            </w:r>
-          </w:p>
-        </w:tc>
-        <w:tc>
-          <w:tcPr>
-            <w:tblW w:w="1500" w:type="dxa"/>
-            <w:tcBorders>
-              <w:top w:val="single" w:color="D8D6CF" w:sz="4"/>
-              <w:left w:val="single" w:color="D8D6CF" w:sz="4"/>
-              <w:bottom w:val="single" w:color="D8D6CF" w:sz="4"/>
-              <w:right w:val="single" w:color="D8D6CF" w:sz="4"/>
-            </w:tcBorders>
-            <w:tcMar>
-              <w:top w:w="80" w:type="dxa"/>
-              <w:bottom w:w="80" w:type="dxa"/>
-              <w:left w:w="120" w:type="dxa"/>
-              <w:right w:w="120" w:type="dxa"/>
-            </w:tcMar>
-          </w:tcPr>
-          <w:p>
-            <w:pPr>
-              <w:spacing w:before="0" w:after="0"/>
-              <w:jc w:val="left"/>
-            </w:pPr>
-            <w:r>
-              <w:rPr>
-                <w:rFonts w:ascii="Arial" w:hAnsi="Arial" w:eastAsia="Arial" w:cs="Arial"/>
-                <w:sz w:val="18"/>
-                <w:color w:val="185FA5"/>
-                <w:b/>
-              </w:rPr>
-              <w:t xml:space="preserve"/>
-            </w:r>
-          </w:p>
-        </w:tc>
-        <w:tc>
-          <w:tcPr>
-            <w:tblW w:w="1000" w:type="dxa"/>
-            <w:tcBorders>
-              <w:top w:val="single" w:color="D8D6CF" w:sz="4"/>
-              <w:left w:val="single" w:color="D8D6CF" w:sz="4"/>
-              <w:bottom w:val="single" w:color="D8D6CF" w:sz="4"/>
-              <w:right w:val="single" w:color="D8D6CF" w:sz="4"/>
-            </w:tcBorders>
-            <w:tcMar>
-              <w:top w:w="80" w:type="dxa"/>
-              <w:bottom w:w="80" w:type="dxa"/>
-              <w:left w:w="120" w:type="dxa"/>
-              <w:right w:w="120" w:type="dxa"/>
-            </w:tcMar>
-          </w:tcPr>
-          <w:p>
-            <w:pPr>
-              <w:spacing w:before="0" w:after="0"/>
-              <w:jc w:val="left"/>
-            </w:pPr>
-            <w:r>
-              <w:rPr>
-                <w:rFonts w:ascii="Arial" w:hAnsi="Arial" w:eastAsia="Arial" w:cs="Arial"/>
-                <w:sz w:val="18"/>
-                <w:color w:val="185FA5"/>
-                <w:b/>
-              </w:rPr>
-              <w:t xml:space="preserve">6987778778</w:t>
-            </w:r>
-          </w:p>
-        </w:tc>
-      </w:tr>
-      <w:tr>
-        <w:tc>
-          <w:tcPr>
-            <w:tblW w:w="3500" w:type="dxa"/>
-            <w:tcBorders>
-              <w:top w:val="single" w:color="D8D6CF" w:sz="4"/>
-              <w:left w:val="single" w:color="D8D6CF" w:sz="4"/>
-              <w:bottom w:val="single" w:color="D8D6CF" w:sz="4"/>
-              <w:right w:val="single" w:color="D8D6CF" w:sz="4"/>
-            </w:tcBorders>
-            <w:tcMar>
-              <w:top w:w="80" w:type="dxa"/>
-              <w:bottom w:w="80" w:type="dxa"/>
-              <w:left w:w="120" w:type="dxa"/>
-              <w:right w:w="120" w:type="dxa"/>
-            </w:tcMar>
-          </w:tcPr>
-          <w:p>
-            <w:pPr>
-              <w:spacing w:before="0" w:after="0"/>
-              <w:jc w:val="left"/>
-            </w:pPr>
-            <w:r>
-              <w:rPr>
-                <w:rFonts w:ascii="Arial" w:hAnsi="Arial" w:eastAsia="Arial" w:cs="Arial"/>
-                <w:sz w:val="18"/>
-                <w:color w:val="185FA5"/>
-                <w:b/>
-              </w:rPr>
-              <w:t xml:space="preserve">Alain T</w:t>
-            </w:r>
-          </w:p>
-        </w:tc>
-        <w:tc>
-          <w:tcPr>
-            <w:tblW w:w="3060" w:type="dxa"/>
-            <w:tcBorders>
-              <w:top w:val="single" w:color="D8D6CF" w:sz="4"/>
-              <w:left w:val="single" w:color="D8D6CF" w:sz="4"/>
-              <w:bottom w:val="single" w:color="D8D6CF" w:sz="4"/>
-              <w:right w:val="single" w:color="D8D6CF" w:sz="4"/>
-            </w:tcBorders>
-            <w:tcMar>
-              <w:top w:w="80" w:type="dxa"/>
-              <w:bottom w:w="80" w:type="dxa"/>
-              <w:left w:w="120" w:type="dxa"/>
-              <w:right w:w="120" w:type="dxa"/>
-            </w:tcMar>
-          </w:tcPr>
-          <w:p>
-            <w:pPr>
-              <w:spacing w:before="0" w:after="0"/>
-              <w:jc w:val="left"/>
-            </w:pPr>
-            <w:r>
-              <w:rPr>
-                <w:rFonts w:ascii="Arial" w:hAnsi="Arial" w:eastAsia="Arial" w:cs="Arial"/>
-                <w:sz w:val="18"/>
-                <w:color w:val="185FA5"/>
-                <w:b/>
-              </w:rPr>
-              <w:t xml:space="preserve">TECHNICIEN</w:t>
-            </w:r>
-          </w:p>
-        </w:tc>
-        <w:tc>
-          <w:tcPr>
-            <w:tblW w:w="1500" w:type="dxa"/>
-            <w:tcBorders>
-              <w:top w:val="single" w:color="D8D6CF" w:sz="4"/>
-              <w:left w:val="single" w:color="D8D6CF" w:sz="4"/>
-              <w:bottom w:val="single" w:color="D8D6CF" w:sz="4"/>
-              <w:right w:val="single" w:color="D8D6CF" w:sz="4"/>
-            </w:tcBorders>
-            <w:tcMar>
-              <w:top w:w="80" w:type="dxa"/>
-              <w:bottom w:w="80" w:type="dxa"/>
-              <w:left w:w="120" w:type="dxa"/>
-              <w:right w:w="120" w:type="dxa"/>
-            </w:tcMar>
-          </w:tcPr>
-          <w:p>
-            <w:pPr>
-              <w:spacing w:before="0" w:after="0"/>
-              <w:jc w:val="left"/>
-            </w:pPr>
-            <w:r>
-              <w:rPr>
-                <w:rFonts w:ascii="Arial" w:hAnsi="Arial" w:eastAsia="Arial" w:cs="Arial"/>
-                <w:sz w:val="18"/>
-                <w:color w:val="185FA5"/>
-                <w:b/>
-              </w:rPr>
-              <w:t xml:space="preserve"/>
-            </w:r>
-          </w:p>
-        </w:tc>
-        <w:tc>
-          <w:tcPr>
-            <w:tblW w:w="1000" w:type="dxa"/>
-            <w:tcBorders>
-              <w:top w:val="single" w:color="D8D6CF" w:sz="4"/>
-              <w:left w:val="single" w:color="D8D6CF" w:sz="4"/>
-              <w:bottom w:val="single" w:color="D8D6CF" w:sz="4"/>
-              <w:right w:val="single" w:color="D8D6CF" w:sz="4"/>
-            </w:tcBorders>
-            <w:tcMar>
-              <w:top w:w="80" w:type="dxa"/>
-              <w:bottom w:w="80" w:type="dxa"/>
-              <w:left w:w="120" w:type="dxa"/>
-              <w:right w:w="120" w:type="dxa"/>
-            </w:tcMar>
-          </w:tcPr>
-          <w:p>
-            <w:pPr>
-              <w:spacing w:before="0" w:after="0"/>
-              <w:jc w:val="left"/>
-            </w:pPr>
-            <w:r>
-              <w:rPr>
-                <w:rFonts w:ascii="Arial" w:hAnsi="Arial" w:eastAsia="Arial" w:cs="Arial"/>
-                <w:sz w:val="18"/>
-                <w:color w:val="185FA5"/>
-                <w:b/>
-              </w:rPr>
-              <w:t xml:space="preserve">054489875</w:t>
-            </w:r>
-          </w:p>
-        </w:tc>
-      </w:tr>
-      <w:tr>
-        <w:tc>
-          <w:tcPr>
-            <w:tblW w:w="3500" w:type="dxa"/>
-            <w:tcBorders>
-              <w:top w:val="single" w:color="D8D6CF" w:sz="4"/>
-              <w:left w:val="single" w:color="D8D6CF" w:sz="4"/>
-              <w:bottom w:val="single" w:color="D8D6CF" w:sz="4"/>
-              <w:right w:val="single" w:color="D8D6CF" w:sz="4"/>
-            </w:tcBorders>
-            <w:tcMar>
-              <w:top w:w="80" w:type="dxa"/>
-              <w:bottom w:w="80" w:type="dxa"/>
-              <w:left w:w="120" w:type="dxa"/>
-              <w:right w:w="120" w:type="dxa"/>
-            </w:tcMar>
-          </w:tcPr>
-          <w:p>
-            <w:pPr>
-              <w:spacing w:before="0" w:after="0"/>
-              <w:jc w:val="left"/>
-            </w:pPr>
-            <w:r>
-              <w:rPr>
-                <w:rFonts w:ascii="Arial" w:hAnsi="Arial" w:eastAsia="Arial" w:cs="Arial"/>
-                <w:sz w:val="18"/>
-                <w:color w:val="185FA5"/>
-                <w:b/>
-              </w:rPr>
-              <w:t xml:space="preserve">Roland Marion</w:t>
-            </w:r>
-          </w:p>
-        </w:tc>
-        <w:tc>
-          <w:tcPr>
-            <w:tblW w:w="3060" w:type="dxa"/>
-            <w:tcBorders>
-              <w:top w:val="single" w:color="D8D6CF" w:sz="4"/>
-              <w:left w:val="single" w:color="D8D6CF" w:sz="4"/>
-              <w:bottom w:val="single" w:color="D8D6CF" w:sz="4"/>
-              <w:right w:val="single" w:color="D8D6CF" w:sz="4"/>
-            </w:tcBorders>
-            <w:tcMar>
-              <w:top w:w="80" w:type="dxa"/>
-              <w:bottom w:w="80" w:type="dxa"/>
-              <w:left w:w="120" w:type="dxa"/>
-              <w:right w:w="120" w:type="dxa"/>
-            </w:tcMar>
-          </w:tcPr>
-          <w:p>
-            <w:pPr>
-              <w:spacing w:before="0" w:after="0"/>
-              <w:jc w:val="left"/>
-            </w:pPr>
-            <w:r>
-              <w:rPr>
-                <w:rFonts w:ascii="Arial" w:hAnsi="Arial" w:eastAsia="Arial" w:cs="Arial"/>
-                <w:sz w:val="18"/>
-                <w:color w:val="185FA5"/>
-                <w:b/>
-              </w:rPr>
-              <w:t xml:space="preserve">SUPERVISEUR</w:t>
-            </w:r>
-          </w:p>
-        </w:tc>
-        <w:tc>
-          <w:tcPr>
-            <w:tblW w:w="1500" w:type="dxa"/>
-            <w:tcBorders>
-              <w:top w:val="single" w:color="D8D6CF" w:sz="4"/>
-              <w:left w:val="single" w:color="D8D6CF" w:sz="4"/>
-              <w:bottom w:val="single" w:color="D8D6CF" w:sz="4"/>
-              <w:right w:val="single" w:color="D8D6CF" w:sz="4"/>
-            </w:tcBorders>
-            <w:tcMar>
-              <w:top w:w="80" w:type="dxa"/>
-              <w:bottom w:w="80" w:type="dxa"/>
-              <w:left w:w="120" w:type="dxa"/>
-              <w:right w:w="120" w:type="dxa"/>
-            </w:tcMar>
-          </w:tcPr>
-          <w:p>
-            <w:pPr>
-              <w:spacing w:before="0" w:after="0"/>
-              <w:jc w:val="left"/>
-            </w:pPr>
-            <w:r>
-              <w:rPr>
-                <w:rFonts w:ascii="Arial" w:hAnsi="Arial" w:eastAsia="Arial" w:cs="Arial"/>
-                <w:sz w:val="18"/>
-                <w:color w:val="185FA5"/>
-                <w:b/>
-              </w:rPr>
-              <w:t xml:space="preserve"/>
-            </w:r>
-          </w:p>
-        </w:tc>
-        <w:tc>
-          <w:tcPr>
-            <w:tblW w:w="1000" w:type="dxa"/>
-            <w:tcBorders>
-              <w:top w:val="single" w:color="D8D6CF" w:sz="4"/>
-              <w:left w:val="single" w:color="D8D6CF" w:sz="4"/>
-              <w:bottom w:val="single" w:color="D8D6CF" w:sz="4"/>
-              <w:right w:val="single" w:color="D8D6CF" w:sz="4"/>
-            </w:tcBorders>
-            <w:tcMar>
-              <w:top w:w="80" w:type="dxa"/>
-              <w:bottom w:w="80" w:type="dxa"/>
-              <w:left w:w="120" w:type="dxa"/>
-              <w:right w:w="120" w:type="dxa"/>
-            </w:tcMar>
-          </w:tcPr>
-          <w:p>
-            <w:pPr>
-              <w:spacing w:before="0" w:after="0"/>
-              <w:jc w:val="left"/>
-            </w:pPr>
-            <w:r>
-              <w:rPr>
-                <w:rFonts w:ascii="Arial" w:hAnsi="Arial" w:eastAsia="Arial" w:cs="Arial"/>
-                <w:sz w:val="18"/>
-                <w:color w:val="185FA5"/>
-                <w:b/>
-              </w:rPr>
-              <w:t xml:space="preserve">68798984</w:t>
-            </w:r>
-          </w:p>
-        </w:tc>
-      </w:tr>
-      <w:tr>
-        <w:tc>
-          <w:tcPr>
-            <w:tblW w:w="3500" w:type="dxa"/>
-            <w:tcBorders>
-              <w:top w:val="single" w:color="D8D6CF" w:sz="4"/>
-              <w:left w:val="single" w:color="D8D6CF" w:sz="4"/>
-              <w:bottom w:val="single" w:color="D8D6CF" w:sz="4"/>
-              <w:right w:val="single" w:color="D8D6CF" w:sz="4"/>
-            </w:tcBorders>
-            <w:tcMar>
-              <w:top w:w="80" w:type="dxa"/>
-              <w:bottom w:w="80" w:type="dxa"/>
-              <w:left w:w="120" w:type="dxa"/>
-              <w:right w:w="120" w:type="dxa"/>
-            </w:tcMar>
-          </w:tcPr>
-          <w:p>
-            <w:pPr>
-              <w:spacing w:before="0" w:after="0"/>
-              <w:jc w:val="left"/>
-            </w:pPr>
-            <w:r>
-              <w:rPr>
-                <w:rFonts w:ascii="Arial" w:hAnsi="Arial" w:eastAsia="Arial" w:cs="Arial"/>
-                <w:sz w:val="18"/>
-                <w:color w:val="185FA5"/>
-                <w:b/>
-              </w:rPr>
-              <w:t xml:space="preserve">Nouho Doris</w:t>
-            </w:r>
-          </w:p>
-        </w:tc>
-        <w:tc>
-          <w:tcPr>
-            <w:tblW w:w="3060" w:type="dxa"/>
-            <w:tcBorders>
-              <w:top w:val="single" w:color="D8D6CF" w:sz="4"/>
-              <w:left w:val="single" w:color="D8D6CF" w:sz="4"/>
-              <w:bottom w:val="single" w:color="D8D6CF" w:sz="4"/>
-              <w:right w:val="single" w:color="D8D6CF" w:sz="4"/>
-            </w:tcBorders>
-            <w:tcMar>
-              <w:top w:w="80" w:type="dxa"/>
-              <w:bottom w:w="80" w:type="dxa"/>
-              <w:left w:w="120" w:type="dxa"/>
-              <w:right w:w="120" w:type="dxa"/>
-            </w:tcMar>
-          </w:tcPr>
-          <w:p>
-            <w:pPr>
-              <w:spacing w:before="0" w:after="0"/>
-              <w:jc w:val="left"/>
-            </w:pPr>
-            <w:r>
-              <w:rPr>
-                <w:rFonts w:ascii="Arial" w:hAnsi="Arial" w:eastAsia="Arial" w:cs="Arial"/>
-                <w:sz w:val="18"/>
-                <w:color w:val="185FA5"/>
-                <w:b/>
-              </w:rPr>
-              <w:t xml:space="preserve">SUPERVISEUR</w:t>
-            </w:r>
-          </w:p>
-        </w:tc>
-        <w:tc>
-          <w:tcPr>
-            <w:tblW w:w="1500" w:type="dxa"/>
-            <w:tcBorders>
-              <w:top w:val="single" w:color="D8D6CF" w:sz="4"/>
-              <w:left w:val="single" w:color="D8D6CF" w:sz="4"/>
-              <w:bottom w:val="single" w:color="D8D6CF" w:sz="4"/>
-              <w:right w:val="single" w:color="D8D6CF" w:sz="4"/>
-            </w:tcBorders>
-            <w:tcMar>
-              <w:top w:w="80" w:type="dxa"/>
-              <w:bottom w:w="80" w:type="dxa"/>
-              <w:left w:w="120" w:type="dxa"/>
-              <w:right w:w="120" w:type="dxa"/>
-            </w:tcMar>
-          </w:tcPr>
-          <w:p>
-            <w:pPr>
-              <w:spacing w:before="0" w:after="0"/>
-              <w:jc w:val="left"/>
-            </w:pPr>
-            <w:r>
-              <w:rPr>
-                <w:rFonts w:ascii="Arial" w:hAnsi="Arial" w:eastAsia="Arial" w:cs="Arial"/>
-                <w:sz w:val="18"/>
-                <w:color w:val="185FA5"/>
-                <w:b/>
-              </w:rPr>
-              <w:t xml:space="preserve"/>
-            </w:r>
-          </w:p>
-        </w:tc>
-        <w:tc>
-          <w:tcPr>
-            <w:tblW w:w="1000" w:type="dxa"/>
-            <w:tcBorders>
-              <w:top w:val="single" w:color="D8D6CF" w:sz="4"/>
-              <w:left w:val="single" w:color="D8D6CF" w:sz="4"/>
-              <w:bottom w:val="single" w:color="D8D6CF" w:sz="4"/>
-              <w:right w:val="single" w:color="D8D6CF" w:sz="4"/>
-            </w:tcBorders>
-            <w:tcMar>
-              <w:top w:w="80" w:type="dxa"/>
-              <w:bottom w:w="80" w:type="dxa"/>
-              <w:left w:w="120" w:type="dxa"/>
-              <w:right w:w="120" w:type="dxa"/>
-            </w:tcMar>
-          </w:tcPr>
-          <w:p>
-            <w:pPr>
-              <w:spacing w:before="0" w:after="0"/>
-              <w:jc w:val="left"/>
-            </w:pPr>
-            <w:r>
-              <w:rPr>
-                <w:rFonts w:ascii="Arial" w:hAnsi="Arial" w:eastAsia="Arial" w:cs="Arial"/>
-                <w:sz w:val="18"/>
-                <w:color w:val="185FA5"/>
-                <w:b/>
-              </w:rPr>
-              <w:t xml:space="preserve">68779459</w:t>
-            </w:r>
-          </w:p>
-        </w:tc>
-      </w:tr>
-      <w:tr>
-        <w:tc>
-          <w:tcPr>
-            <w:tblW w:w="3500" w:type="dxa"/>
-            <w:tcBorders>
-              <w:top w:val="single" w:color="D8D6CF" w:sz="4"/>
-              <w:left w:val="single" w:color="D8D6CF" w:sz="4"/>
-              <w:bottom w:val="single" w:color="D8D6CF" w:sz="4"/>
-              <w:right w:val="single" w:color="D8D6CF" w:sz="4"/>
-            </w:tcBorders>
-            <w:tcMar>
-              <w:top w:w="80" w:type="dxa"/>
-              <w:bottom w:w="80" w:type="dxa"/>
-              <w:left w:w="120" w:type="dxa"/>
-              <w:right w:w="120" w:type="dxa"/>
-            </w:tcMar>
-          </w:tcPr>
-          <w:p>
-            <w:pPr>
-              <w:spacing w:before="0" w:after="0"/>
-              <w:jc w:val="left"/>
-            </w:pPr>
-            <w:r>
-              <w:rPr>
-                <w:rFonts w:ascii="Arial" w:hAnsi="Arial" w:eastAsia="Arial" w:cs="Arial"/>
-                <w:sz w:val="18"/>
-                <w:color w:val="185FA5"/>
-                <w:b/>
-              </w:rPr>
-              <w:t xml:space="preserve">Takam Bernard</w:t>
-            </w:r>
-          </w:p>
-        </w:tc>
-        <w:tc>
-          <w:tcPr>
-            <w:tblW w:w="3060" w:type="dxa"/>
-            <w:tcBorders>
-              <w:top w:val="single" w:color="D8D6CF" w:sz="4"/>
-              <w:left w:val="single" w:color="D8D6CF" w:sz="4"/>
-              <w:bottom w:val="single" w:color="D8D6CF" w:sz="4"/>
-              <w:right w:val="single" w:color="D8D6CF" w:sz="4"/>
-            </w:tcBorders>
-            <w:tcMar>
-              <w:top w:w="80" w:type="dxa"/>
-              <w:bottom w:w="80" w:type="dxa"/>
-              <w:left w:w="120" w:type="dxa"/>
-              <w:right w:w="120" w:type="dxa"/>
-            </w:tcMar>
-          </w:tcPr>
-          <w:p>
-            <w:pPr>
-              <w:spacing w:before="0" w:after="0"/>
-              <w:jc w:val="left"/>
-            </w:pPr>
-            <w:r>
-              <w:rPr>
-                <w:rFonts w:ascii="Arial" w:hAnsi="Arial" w:eastAsia="Arial" w:cs="Arial"/>
-                <w:sz w:val="18"/>
-                <w:color w:val="185FA5"/>
-                <w:b/>
-              </w:rPr>
-              <w:t xml:space="preserve">ADMIN</w:t>
-            </w:r>
-          </w:p>
-        </w:tc>
-        <w:tc>
-          <w:tcPr>
-            <w:tblW w:w="1500" w:type="dxa"/>
-            <w:tcBorders>
-              <w:top w:val="single" w:color="D8D6CF" w:sz="4"/>
-              <w:left w:val="single" w:color="D8D6CF" w:sz="4"/>
-              <w:bottom w:val="single" w:color="D8D6CF" w:sz="4"/>
-              <w:right w:val="single" w:color="D8D6CF" w:sz="4"/>
-            </w:tcBorders>
-            <w:tcMar>
-              <w:top w:w="80" w:type="dxa"/>
-              <w:bottom w:w="80" w:type="dxa"/>
-              <w:left w:w="120" w:type="dxa"/>
-              <w:right w:w="120" w:type="dxa"/>
-            </w:tcMar>
-          </w:tcPr>
-          <w:p>
-            <w:pPr>
-              <w:spacing w:before="0" w:after="0"/>
-              <w:jc w:val="left"/>
-            </w:pPr>
-            <w:r>
-              <w:rPr>
-                <w:rFonts w:ascii="Arial" w:hAnsi="Arial" w:eastAsia="Arial" w:cs="Arial"/>
-                <w:sz w:val="18"/>
-                <w:color w:val="185FA5"/>
-                <w:b/>
-              </w:rPr>
-              <w:t xml:space="preserve"/>
-            </w:r>
-          </w:p>
-        </w:tc>
-        <w:tc>
-          <w:tcPr>
-            <w:tblW w:w="1000" w:type="dxa"/>
-            <w:tcBorders>
-              <w:top w:val="single" w:color="D8D6CF" w:sz="4"/>
-              <w:left w:val="single" w:color="D8D6CF" w:sz="4"/>
-              <w:bottom w:val="single" w:color="D8D6CF" w:sz="4"/>
-              <w:right w:val="single" w:color="D8D6CF" w:sz="4"/>
-            </w:tcBorders>
-            <w:tcMar>
-              <w:top w:w="80" w:type="dxa"/>
-              <w:bottom w:w="80" w:type="dxa"/>
-              <w:left w:w="120" w:type="dxa"/>
-              <w:right w:w="120" w:type="dxa"/>
-            </w:tcMar>
-          </w:tcPr>
-          <w:p>
-            <w:pPr>
-              <w:spacing w:before="0" w:after="0"/>
-              <w:jc w:val="left"/>
-            </w:pPr>
-            <w:r>
-              <w:rPr>
-                <w:rFonts w:ascii="Arial" w:hAnsi="Arial" w:eastAsia="Arial" w:cs="Arial"/>
-                <w:sz w:val="18"/>
-                <w:color w:val="185FA5"/>
-                <w:b/>
-              </w:rPr>
-              <w:t xml:space="preserve">6877945997</w:t>
             </w:r>
           </w:p>
         </w:tc>
@@ -1487,7 +707,7 @@
                 <w:sz w:val="20"/>
                 <w:color w:val="1A1A18"/>
               </w:rPr>
-              <w:t xml:space="preserve">Survenu dans des circonstances troubles</w:t>
+              <w:t xml:space="preserve">Simple intervention</w:t>
             </w:r>
           </w:p>
         </w:tc>
@@ -3573,7 +2793,7 @@
         <w:sz w:val="16"/>
         <w:color w:val="6B6B66"/>
       </w:rPr>
-      <w:t xml:space="preserve">	INT-NDOK-1005  ·  Page </w:t>
+      <w:t xml:space="preserve">	INT-2026-1505-NDF  ·  Page </w:t>
     </w:r>
     <w:fldSimple w:instr="PAGE"/>
     <w:r>
@@ -3582,7 +2802,7 @@
         <w:sz w:val="16"/>
         <w:color w:val="6B6B66"/>
       </w:rPr>
-      <w:t xml:space="preserve">	Exporté le 25/05/2026</w:t>
+      <w:t xml:space="preserve">	Exporté le 13/06/2026</w:t>
     </w:r>
   </w:p>
 </w:ftr>

</xml_diff>